<commit_message>
66) Proyecto 1 Sitio Web/CMS LAESH deploy Producción en hostinger VM con dominio laesh.mx. Scripts setup reproducibles. Todo proyecto 1 al 94%, Falta: Estabilizar Fichas de promosiones cms bd, busquedas y paginado; PA laesh, Publicar en SEO Google search, Deploy en ambiente pruebas Caelitandem. Ya todos los features de alcance incluidos (cms: Facebook no jalara). Falta de optimizar lo del cache v?=time, swole, opcache, rte letras y tamaños. ToDo: Pruebas aleatorias/estabilización. Avance en Block digital al:70%.
</commit_message>
<xml_diff>
--- a/portafolio-dev-2026/blocklabgd/v1.2/contrato/Acta_Aceptacion_Adenda_Sitio_Web_v4.docx
+++ b/portafolio-dev-2026/blocklabgd/v1.2/contrato/Acta_Aceptacion_Adenda_Sitio_Web_v4.docx
@@ -6,7 +6,7 @@
       <w:pPr>
         <w:pStyle w:val="Heading1"/>
         <w:bidi w:val="0"/>
-        <w:spacing w:before="240" w:after="283"/>
+        <w:spacing w:before="240" w:after="120"/>
         <w:rPr/>
       </w:pPr>
       <w:r>
@@ -37,7 +37,7 @@
       <w:pPr>
         <w:pStyle w:val="BodyText"/>
         <w:bidi w:val="0"/>
-        <w:spacing w:before="0" w:after="283"/>
+        <w:spacing w:lineRule="auto" w:line="276" w:before="0" w:after="283"/>
         <w:jc w:val="both"/>
         <w:rPr/>
       </w:pPr>
@@ -99,6 +99,7 @@
     <w:p>
       <w:pPr>
         <w:pStyle w:val="HorizontalLine"/>
+        <w:suppressLineNumbers/>
         <w:pBdr>
           <w:bottom w:val="double" w:sz="2" w:space="0" w:color="808080"/>
         </w:pBdr>
@@ -133,7 +134,7 @@
       <w:pPr>
         <w:pStyle w:val="BodyText"/>
         <w:bidi w:val="0"/>
-        <w:spacing w:before="0" w:after="283"/>
+        <w:spacing w:lineRule="auto" w:line="276" w:before="0" w:after="283"/>
         <w:jc w:val="both"/>
         <w:rPr/>
       </w:pPr>
@@ -194,7 +195,7 @@
       <w:pPr>
         <w:pStyle w:val="BodyText"/>
         <w:bidi w:val="0"/>
-        <w:spacing w:before="0" w:after="283"/>
+        <w:spacing w:lineRule="auto" w:line="276" w:before="0" w:after="283"/>
         <w:jc w:val="both"/>
         <w:rPr/>
       </w:pPr>
@@ -215,7 +216,7 @@
     </w:p>
     <w:tbl>
       <w:tblPr>
-        <w:tblW w:w="9638" w:type="dxa"/>
+        <w:tblW w:w="9972" w:type="dxa"/>
         <w:jc w:val="start"/>
         <w:tblInd w:w="0" w:type="dxa"/>
         <w:tblLayout w:type="fixed"/>
@@ -227,8 +228,8 @@
         </w:tblCellMar>
       </w:tblPr>
       <w:tblGrid>
-        <w:gridCol w:w="2856"/>
-        <w:gridCol w:w="6782"/>
+        <w:gridCol w:w="2908"/>
+        <w:gridCol w:w="7064"/>
       </w:tblGrid>
       <w:tr>
         <w:trPr>
@@ -236,7 +237,7 @@
         </w:trPr>
         <w:tc>
           <w:tcPr>
-            <w:tcW w:w="2856" w:type="dxa"/>
+            <w:tcW w:w="2908" w:type="dxa"/>
             <w:tcBorders/>
             <w:vAlign w:val="center"/>
           </w:tcPr>
@@ -244,7 +245,6 @@
             <w:pPr>
               <w:pStyle w:val="TableHeading"/>
               <w:bidi w:val="0"/>
-              <w:spacing w:before="0" w:after="283"/>
               <w:ind w:hanging="0" w:start="0" w:end="0"/>
               <w:jc w:val="start"/>
               <w:rPr/>
@@ -257,7 +257,7 @@
         </w:tc>
         <w:tc>
           <w:tcPr>
-            <w:tcW w:w="6782" w:type="dxa"/>
+            <w:tcW w:w="7064" w:type="dxa"/>
             <w:tcBorders/>
             <w:vAlign w:val="center"/>
           </w:tcPr>
@@ -265,7 +265,6 @@
             <w:pPr>
               <w:pStyle w:val="TableHeading"/>
               <w:bidi w:val="0"/>
-              <w:spacing w:before="0" w:after="283"/>
               <w:ind w:hanging="0" w:start="0" w:end="0"/>
               <w:jc w:val="start"/>
               <w:rPr/>
@@ -281,7 +280,7 @@
         <w:trPr/>
         <w:tc>
           <w:tcPr>
-            <w:tcW w:w="2856" w:type="dxa"/>
+            <w:tcW w:w="2908" w:type="dxa"/>
             <w:tcBorders/>
             <w:vAlign w:val="center"/>
           </w:tcPr>
@@ -289,7 +288,6 @@
             <w:pPr>
               <w:pStyle w:val="TableContents"/>
               <w:bidi w:val="0"/>
-              <w:spacing w:before="0" w:after="283"/>
               <w:ind w:hanging="0" w:start="0" w:end="0"/>
               <w:jc w:val="start"/>
               <w:rPr/>
@@ -304,7 +302,7 @@
         </w:tc>
         <w:tc>
           <w:tcPr>
-            <w:tcW w:w="6782" w:type="dxa"/>
+            <w:tcW w:w="7064" w:type="dxa"/>
             <w:tcBorders/>
             <w:vAlign w:val="center"/>
           </w:tcPr>
@@ -312,7 +310,6 @@
             <w:pPr>
               <w:pStyle w:val="TableContents"/>
               <w:bidi w:val="0"/>
-              <w:spacing w:before="0" w:after="283"/>
               <w:ind w:hanging="0" w:start="0" w:end="0"/>
               <w:jc w:val="start"/>
               <w:rPr/>
@@ -328,7 +325,7 @@
         <w:trPr/>
         <w:tc>
           <w:tcPr>
-            <w:tcW w:w="2856" w:type="dxa"/>
+            <w:tcW w:w="2908" w:type="dxa"/>
             <w:tcBorders/>
             <w:vAlign w:val="center"/>
           </w:tcPr>
@@ -336,7 +333,6 @@
             <w:pPr>
               <w:pStyle w:val="TableContents"/>
               <w:bidi w:val="0"/>
-              <w:spacing w:before="0" w:after="283"/>
               <w:ind w:hanging="0" w:start="0" w:end="0"/>
               <w:jc w:val="start"/>
               <w:rPr/>
@@ -351,7 +347,7 @@
         </w:tc>
         <w:tc>
           <w:tcPr>
-            <w:tcW w:w="6782" w:type="dxa"/>
+            <w:tcW w:w="7064" w:type="dxa"/>
             <w:tcBorders/>
             <w:vAlign w:val="center"/>
           </w:tcPr>
@@ -359,7 +355,6 @@
             <w:pPr>
               <w:pStyle w:val="TableContents"/>
               <w:bidi w:val="0"/>
-              <w:spacing w:before="0" w:after="283"/>
               <w:ind w:hanging="0" w:start="0" w:end="0"/>
               <w:jc w:val="start"/>
               <w:rPr/>
@@ -375,7 +370,7 @@
         <w:trPr/>
         <w:tc>
           <w:tcPr>
-            <w:tcW w:w="2856" w:type="dxa"/>
+            <w:tcW w:w="2908" w:type="dxa"/>
             <w:tcBorders/>
             <w:vAlign w:val="center"/>
           </w:tcPr>
@@ -383,7 +378,6 @@
             <w:pPr>
               <w:pStyle w:val="TableContents"/>
               <w:bidi w:val="0"/>
-              <w:spacing w:before="0" w:after="283"/>
               <w:ind w:hanging="0" w:start="0" w:end="0"/>
               <w:jc w:val="start"/>
               <w:rPr/>
@@ -398,7 +392,7 @@
         </w:tc>
         <w:tc>
           <w:tcPr>
-            <w:tcW w:w="6782" w:type="dxa"/>
+            <w:tcW w:w="7064" w:type="dxa"/>
             <w:tcBorders/>
             <w:vAlign w:val="center"/>
           </w:tcPr>
@@ -406,7 +400,6 @@
             <w:pPr>
               <w:pStyle w:val="TableContents"/>
               <w:bidi w:val="0"/>
-              <w:spacing w:before="0" w:after="283"/>
               <w:ind w:hanging="0" w:start="0" w:end="0"/>
               <w:jc w:val="start"/>
               <w:rPr/>
@@ -422,7 +415,7 @@
         <w:trPr/>
         <w:tc>
           <w:tcPr>
-            <w:tcW w:w="2856" w:type="dxa"/>
+            <w:tcW w:w="2908" w:type="dxa"/>
             <w:tcBorders/>
             <w:vAlign w:val="center"/>
           </w:tcPr>
@@ -430,7 +423,6 @@
             <w:pPr>
               <w:pStyle w:val="TableContents"/>
               <w:bidi w:val="0"/>
-              <w:spacing w:before="0" w:after="283"/>
               <w:ind w:hanging="0" w:start="0" w:end="0"/>
               <w:jc w:val="start"/>
               <w:rPr/>
@@ -445,7 +437,7 @@
         </w:tc>
         <w:tc>
           <w:tcPr>
-            <w:tcW w:w="6782" w:type="dxa"/>
+            <w:tcW w:w="7064" w:type="dxa"/>
             <w:tcBorders/>
             <w:vAlign w:val="center"/>
           </w:tcPr>
@@ -453,7 +445,6 @@
             <w:pPr>
               <w:pStyle w:val="TableContents"/>
               <w:bidi w:val="0"/>
-              <w:spacing w:before="0" w:after="283"/>
               <w:jc w:val="start"/>
               <w:rPr/>
             </w:pPr>
@@ -485,7 +476,7 @@
     </w:p>
     <w:tbl>
       <w:tblPr>
-        <w:tblW w:w="9638" w:type="dxa"/>
+        <w:tblW w:w="9972" w:type="dxa"/>
         <w:jc w:val="start"/>
         <w:tblInd w:w="0" w:type="dxa"/>
         <w:tblLayout w:type="fixed"/>
@@ -497,8 +488,8 @@
         </w:tblCellMar>
       </w:tblPr>
       <w:tblGrid>
-        <w:gridCol w:w="6767"/>
-        <w:gridCol w:w="2871"/>
+        <w:gridCol w:w="7021"/>
+        <w:gridCol w:w="2951"/>
       </w:tblGrid>
       <w:tr>
         <w:trPr>
@@ -506,7 +497,7 @@
         </w:trPr>
         <w:tc>
           <w:tcPr>
-            <w:tcW w:w="6767" w:type="dxa"/>
+            <w:tcW w:w="7021" w:type="dxa"/>
             <w:tcBorders/>
             <w:vAlign w:val="center"/>
           </w:tcPr>
@@ -514,7 +505,6 @@
             <w:pPr>
               <w:pStyle w:val="TableHeading"/>
               <w:bidi w:val="0"/>
-              <w:spacing w:before="0" w:after="283"/>
               <w:ind w:hanging="0" w:start="0" w:end="0"/>
               <w:jc w:val="start"/>
               <w:rPr/>
@@ -527,7 +517,7 @@
         </w:tc>
         <w:tc>
           <w:tcPr>
-            <w:tcW w:w="2871" w:type="dxa"/>
+            <w:tcW w:w="2951" w:type="dxa"/>
             <w:tcBorders/>
             <w:vAlign w:val="center"/>
           </w:tcPr>
@@ -535,7 +525,6 @@
             <w:pPr>
               <w:pStyle w:val="TableHeading"/>
               <w:bidi w:val="0"/>
-              <w:spacing w:before="0" w:after="283"/>
               <w:ind w:hanging="0" w:start="0" w:end="0"/>
               <w:jc w:val="center"/>
               <w:rPr/>
@@ -551,7 +540,7 @@
         <w:trPr/>
         <w:tc>
           <w:tcPr>
-            <w:tcW w:w="6767" w:type="dxa"/>
+            <w:tcW w:w="7021" w:type="dxa"/>
             <w:tcBorders/>
             <w:vAlign w:val="center"/>
           </w:tcPr>
@@ -559,7 +548,6 @@
             <w:pPr>
               <w:pStyle w:val="TableContents"/>
               <w:bidi w:val="0"/>
-              <w:spacing w:before="0" w:after="283"/>
               <w:ind w:hanging="0" w:start="0" w:end="0"/>
               <w:jc w:val="start"/>
               <w:rPr/>
@@ -574,7 +562,7 @@
         </w:tc>
         <w:tc>
           <w:tcPr>
-            <w:tcW w:w="2871" w:type="dxa"/>
+            <w:tcW w:w="2951" w:type="dxa"/>
             <w:tcBorders/>
             <w:vAlign w:val="center"/>
           </w:tcPr>
@@ -582,7 +570,6 @@
             <w:pPr>
               <w:pStyle w:val="TableContents"/>
               <w:bidi w:val="0"/>
-              <w:spacing w:before="0" w:after="283"/>
               <w:ind w:hanging="0" w:start="0" w:end="0"/>
               <w:jc w:val="center"/>
               <w:rPr/>
@@ -600,7 +587,7 @@
         <w:trPr/>
         <w:tc>
           <w:tcPr>
-            <w:tcW w:w="6767" w:type="dxa"/>
+            <w:tcW w:w="7021" w:type="dxa"/>
             <w:tcBorders/>
             <w:vAlign w:val="center"/>
           </w:tcPr>
@@ -608,7 +595,6 @@
             <w:pPr>
               <w:pStyle w:val="TableContents"/>
               <w:bidi w:val="0"/>
-              <w:spacing w:before="0" w:after="283"/>
               <w:ind w:hanging="0" w:start="0" w:end="0"/>
               <w:jc w:val="start"/>
               <w:rPr/>
@@ -623,7 +609,7 @@
         </w:tc>
         <w:tc>
           <w:tcPr>
-            <w:tcW w:w="2871" w:type="dxa"/>
+            <w:tcW w:w="2951" w:type="dxa"/>
             <w:tcBorders/>
             <w:vAlign w:val="center"/>
           </w:tcPr>
@@ -631,7 +617,6 @@
             <w:pPr>
               <w:pStyle w:val="TableContents"/>
               <w:bidi w:val="0"/>
-              <w:spacing w:before="0" w:after="283"/>
               <w:jc w:val="center"/>
               <w:rPr/>
             </w:pPr>
@@ -667,7 +652,7 @@
       <w:pPr>
         <w:pStyle w:val="BodyText"/>
         <w:bidi w:val="0"/>
-        <w:spacing w:before="0" w:after="283"/>
+        <w:spacing w:lineRule="auto" w:line="276" w:before="0" w:after="283"/>
         <w:jc w:val="both"/>
         <w:rPr/>
       </w:pPr>
@@ -709,6 +694,7 @@
     <w:p>
       <w:pPr>
         <w:pStyle w:val="HorizontalLine"/>
+        <w:suppressLineNumbers/>
         <w:pBdr>
           <w:bottom w:val="double" w:sz="2" w:space="0" w:color="808080"/>
         </w:pBdr>
@@ -724,6 +710,7 @@
     <w:p>
       <w:pPr>
         <w:pStyle w:val="HorizontalLine"/>
+        <w:suppressLineNumbers/>
         <w:pBdr>
           <w:bottom w:val="double" w:sz="2" w:space="0" w:color="808080"/>
         </w:pBdr>
@@ -740,7 +727,7 @@
       <w:pPr>
         <w:pStyle w:val="BodyText"/>
         <w:bidi w:val="0"/>
-        <w:spacing w:before="0" w:after="283"/>
+        <w:spacing w:lineRule="auto" w:line="276" w:before="0" w:after="283"/>
         <w:jc w:val="both"/>
         <w:rPr/>
       </w:pPr>
@@ -758,6 +745,7 @@
     <w:p>
       <w:pPr>
         <w:pStyle w:val="HorizontalLine"/>
+        <w:suppressLineNumbers/>
         <w:pBdr>
           <w:bottom w:val="double" w:sz="2" w:space="0" w:color="808080"/>
         </w:pBdr>
@@ -774,7 +762,7 @@
       <w:pPr>
         <w:pStyle w:val="BodyText"/>
         <w:bidi w:val="0"/>
-        <w:spacing w:before="0" w:after="283"/>
+        <w:spacing w:lineRule="auto" w:line="276" w:before="0" w:after="283"/>
         <w:jc w:val="both"/>
         <w:rPr/>
       </w:pPr>
@@ -802,7 +790,7 @@
     </w:p>
     <w:sectPr>
       <w:type w:val="nextPage"/>
-      <w:pgSz w:w="11906" w:h="16838"/>
+      <w:pgSz w:w="12240" w:h="15840"/>
       <w:pgMar w:left="1134" w:right="1134" w:gutter="0" w:header="0" w:top="907" w:footer="0" w:bottom="907"/>
       <w:pgNumType w:fmt="decimal"/>
       <w:formProt w:val="false"/>
@@ -855,12 +843,19 @@
     <w:next w:val="BodyText"/>
     <w:qFormat/>
     <w:pPr>
+      <w:numPr>
+        <w:ilvl w:val="0"/>
+        <w:numId w:val="0"/>
+      </w:numPr>
       <w:pBdr>
         <w:bottom w:val="single" w:sz="12" w:space="4" w:color="0D9488"/>
       </w:pBdr>
+      <w:spacing w:before="240" w:after="120"/>
       <w:jc w:val="center"/>
+      <w:outlineLvl w:val="0"/>
     </w:pPr>
     <w:rPr>
+      <w:rFonts w:ascii="Liberation Serif" w:hAnsi="Liberation Serif" w:eastAsia="Noto Serif CJK SC" w:cs="Lohit Devanagari"/>
       <w:b/>
       <w:bCs/>
       <w:color w:val="0F766E"/>
@@ -917,27 +912,30 @@
       <w:szCs w:val="28"/>
     </w:rPr>
   </w:style>
-  <w:style w:type="character" w:styleId="EndnoteReference">
-    <w:name w:val="endnote reference"/>
-    <w:rPr>
-      <w:vertAlign w:val="superscript"/>
-    </w:rPr>
-  </w:style>
-  <w:style w:type="character" w:styleId="FootnoteReference">
-    <w:name w:val="footnote reference"/>
-    <w:rPr>
-      <w:vertAlign w:val="superscript"/>
-    </w:rPr>
-  </w:style>
-  <w:style w:type="character" w:styleId="EndnoteCharacters">
-    <w:name w:val="Endnote Characters"/>
-    <w:qFormat/>
-    <w:rPr/>
-  </w:style>
-  <w:style w:type="character" w:styleId="FootnoteCharacters">
-    <w:name w:val="Footnote Characters"/>
-    <w:qFormat/>
-    <w:rPr/>
+  <w:style w:type="character" w:styleId="Emphasis">
+    <w:name w:val="Emphasis"/>
+    <w:qFormat/>
+    <w:rPr>
+      <w:i/>
+      <w:iCs/>
+      <w:color w:val="4A5568"/>
+    </w:rPr>
+  </w:style>
+  <w:style w:type="character" w:styleId="Strong">
+    <w:name w:val="Strong"/>
+    <w:qFormat/>
+    <w:rPr>
+      <w:b/>
+      <w:bCs/>
+      <w:color w:val="1A202C"/>
+    </w:rPr>
+  </w:style>
+  <w:style w:type="character" w:styleId="SourceText">
+    <w:name w:val="Source Text"/>
+    <w:qFormat/>
+    <w:rPr>
+      <w:rFonts w:ascii="Liberation Mono" w:hAnsi="Liberation Mono" w:eastAsia="Noto Sans Mono CJK SC" w:cs="Liberation Mono"/>
+    </w:rPr>
   </w:style>
   <w:style w:type="character" w:styleId="Hyperlink">
     <w:name w:val="Hyperlink"/>
@@ -949,31 +947,6 @@
       <w:effect w:val="none"/>
     </w:rPr>
   </w:style>
-  <w:style w:type="character" w:styleId="Emphasis">
-    <w:name w:val="Emphasis"/>
-    <w:qFormat/>
-    <w:rPr>
-      <w:i/>
-      <w:iCs/>
-      <w:color w:val="4A5568"/>
-    </w:rPr>
-  </w:style>
-  <w:style w:type="character" w:styleId="Strong">
-    <w:name w:val="Strong"/>
-    <w:qFormat/>
-    <w:rPr>
-      <w:b/>
-      <w:bCs/>
-      <w:color w:val="1A202C"/>
-    </w:rPr>
-  </w:style>
-  <w:style w:type="character" w:styleId="SourceText">
-    <w:name w:val="Source Text"/>
-    <w:qFormat/>
-    <w:rPr>
-      <w:rFonts w:ascii="Liberation Mono" w:hAnsi="Liberation Mono" w:eastAsia="Noto Sans Mono CJK SC" w:cs="Liberation Mono"/>
-    </w:rPr>
-  </w:style>
   <w:style w:type="character" w:styleId="FollowedHyperlink">
     <w:name w:val="FollowedHyperlink"/>
     <w:rPr>
@@ -984,44 +957,12 @@
       <w:effect w:val="none"/>
     </w:rPr>
   </w:style>
-  <w:style w:type="paragraph" w:styleId="HorizontalLine">
-    <w:name w:val="Horizontal Line"/>
-    <w:basedOn w:val="Normal"/>
-    <w:next w:val="BodyText"/>
-    <w:qFormat/>
-    <w:pPr>
-      <w:pBdr>
-        <w:bottom w:val="double" w:sz="2" w:space="0" w:color="808080"/>
-      </w:pBdr>
-      <w:spacing w:before="0" w:after="283"/>
-    </w:pPr>
-    <w:rPr>
-      <w:sz w:val="12"/>
-    </w:rPr>
-  </w:style>
   <w:style w:type="paragraph" w:styleId="BodyText">
     <w:name w:val="Body Text"/>
     <w:basedOn w:val="Normal"/>
     <w:pPr>
-      <w:spacing w:before="0" w:after="283"/>
+      <w:spacing w:lineRule="auto" w:line="276" w:before="0" w:after="283"/>
       <w:jc w:val="both"/>
-    </w:pPr>
-    <w:rPr/>
-  </w:style>
-  <w:style w:type="paragraph" w:styleId="EnvelopeReturn">
-    <w:name w:val="envelope return"/>
-    <w:basedOn w:val="Normal"/>
-    <w:pPr/>
-    <w:rPr>
-      <w:i/>
-    </w:rPr>
-  </w:style>
-  <w:style w:type="paragraph" w:styleId="TableContents">
-    <w:name w:val="Table Contents"/>
-    <w:basedOn w:val="BodyText"/>
-    <w:qFormat/>
-    <w:pPr>
-      <w:jc w:val="start"/>
     </w:pPr>
     <w:rPr/>
   </w:style>
@@ -1035,18 +976,15 @@
       <w:spacing w:before="240" w:after="283"/>
     </w:pPr>
     <w:rPr>
-      <w:rFonts w:ascii="Liberation Sans" w:hAnsi="Liberation Sans"/>
+      <w:rFonts w:ascii="Liberation Sans" w:hAnsi="Liberation Sans" w:eastAsia="Noto Sans CJK SC" w:cs="Lohit Devanagari"/>
       <w:sz w:val="28"/>
       <w:szCs w:val="28"/>
     </w:rPr>
   </w:style>
-  <w:style w:type="paragraph" w:styleId="Index">
-    <w:name w:val="Index"/>
-    <w:basedOn w:val="Normal"/>
-    <w:qFormat/>
-    <w:pPr>
-      <w:suppressLineNumbers/>
-    </w:pPr>
+  <w:style w:type="paragraph" w:styleId="List">
+    <w:name w:val="List"/>
+    <w:basedOn w:val="BodyText"/>
+    <w:pPr/>
     <w:rPr>
       <w:rFonts w:cs="Lohit Devanagari"/>
     </w:rPr>
@@ -1067,10 +1005,13 @@
       <w:szCs w:val="24"/>
     </w:rPr>
   </w:style>
-  <w:style w:type="paragraph" w:styleId="List">
-    <w:name w:val="List"/>
-    <w:basedOn w:val="BodyText"/>
-    <w:pPr/>
+  <w:style w:type="paragraph" w:styleId="Index">
+    <w:name w:val="Index"/>
+    <w:basedOn w:val="Normal"/>
+    <w:qFormat/>
+    <w:pPr>
+      <w:suppressLineNumbers/>
+    </w:pPr>
     <w:rPr>
       <w:rFonts w:cs="Lohit Devanagari"/>
     </w:rPr>
@@ -1085,6 +1026,34 @@
       </w:pBdr>
       <w:spacing w:before="0" w:after="283"/>
       <w:ind w:hanging="0" w:start="567" w:end="567"/>
+    </w:pPr>
+    <w:rPr/>
+  </w:style>
+  <w:style w:type="paragraph" w:styleId="HorizontalLine">
+    <w:name w:val="Horizontal Line"/>
+    <w:basedOn w:val="Normal"/>
+    <w:next w:val="BodyText"/>
+    <w:qFormat/>
+    <w:pPr>
+      <w:suppressLineNumbers/>
+      <w:pBdr>
+        <w:bottom w:val="double" w:sz="2" w:space="0" w:color="808080"/>
+      </w:pBdr>
+      <w:spacing w:before="0" w:after="283"/>
+    </w:pPr>
+    <w:rPr>
+      <w:sz w:val="12"/>
+      <w:szCs w:val="12"/>
+    </w:rPr>
+  </w:style>
+  <w:style w:type="paragraph" w:styleId="TableContents">
+    <w:name w:val="Table Contents"/>
+    <w:basedOn w:val="Normal"/>
+    <w:qFormat/>
+    <w:pPr>
+      <w:widowControl w:val="false"/>
+      <w:suppressLineNumbers/>
+      <w:jc w:val="start"/>
     </w:pPr>
     <w:rPr/>
   </w:style>

</xml_diff>